<commit_message>
Regenerate resumes/cover letters (2026-10-30_000332)
</commit_message>
<xml_diff>
--- a/generated/SDE/Dennis Dole Resume (SDE).docx
+++ b/generated/SDE/Dennis Dole Resume (SDE).docx
@@ -11,7 +11,7 @@
         <w:rPr>
           <w:b/>
           <w:color w:val="1F3864"/>
-          <w:sz w:val="37"/>
+          <w:sz w:val="36"/>
         </w:rPr>
         <w:t>Dennis Jay Dole</w:t>
       </w:r>
@@ -23,7 +23,7 @@
       </w:pPr>
       <w:r>
         <w:rPr>
-          <w:sz w:val="17"/>
+          <w:sz w:val="16"/>
         </w:rPr>
         <w:t>Dennis.Dole@djdole.net · 734-218-2358 · https://www.linkedin.com/in/djdole/ · https://github.com/djdole</w:t>
       </w:r>
@@ -39,7 +39,7 @@
         <w:rPr>
           <w:b/>
           <w:color w:val="1F3864"/>
-          <w:sz w:val="22"/>
+          <w:sz w:val="21"/>
         </w:rPr>
         <w:t>SUMMARY</w:t>
       </w:r>
@@ -63,7 +63,7 @@
         <w:rPr>
           <w:b/>
           <w:color w:val="1F3864"/>
-          <w:sz w:val="22"/>
+          <w:sz w:val="21"/>
         </w:rPr>
         <w:t>CORE TECHNICAL SKILLS</w:t>
       </w:r>
@@ -79,7 +79,7 @@
         <w:t xml:space="preserve">Languages: </w:t>
       </w:r>
       <w:r>
-        <w:t>C#, Ruby, Python, Java, PHP, Node.js, Bash, PowerShell, C++, Lisp, Visual Basic, JavaScript</w:t>
+        <w:t>C#, Ruby, Python, Java, PHP, Node.js, Bash, PowerShell, C++, Lisp, Visual Basic, JavaScript, TypeScript, Shell scripting</w:t>
       </w:r>
     </w:p>
     <w:p>
@@ -93,7 +93,7 @@
         <w:t xml:space="preserve">APIs &amp; Web Servers: </w:t>
       </w:r>
       <w:r>
-        <w:t>REST API design, Apache HTTPD/Tomcat, IIS, nginx, Node.js, MongoDB</w:t>
+        <w:t>REST API design, Apache HTTPD/Tomcat, IIS, nginx, Node.js, MongoDB, SOAP, XML, JSON, webhooks, HMAC authentication, x509 certificates</w:t>
       </w:r>
     </w:p>
     <w:p>
@@ -121,7 +121,7 @@
         <w:t xml:space="preserve">Test Automation Frameworks: </w:t>
       </w:r>
       <w:r>
-        <w:t>Selenium, Playwright, Echo, Docusign's SAW Ruby framework, KAF (Kahuna Automation Framework), custom API test/automation harnesses</w:t>
+        <w:t>Selenium, Playwright, Echo, Docusign's SAW Ruby framework, KAF (Kahuna Automation Framework), custom API test/automation harnesses, TestNG, iMacros, Cucumber (BDD), Page Object Model</w:t>
       </w:r>
     </w:p>
     <w:p>
@@ -135,7 +135,7 @@
         <w:t xml:space="preserve">Frontend &amp; Mobile Testing: </w:t>
       </w:r>
       <w:r>
-        <w:t>Angular (manual + Selenium automated testing), React (manual + Selenium automated testing), mobile application manual testing</w:t>
+        <w:t>Angular (manual + Selenium automated testing), React (manual + Selenium automated testing), mobile application manual testing, Playwright (JavaScript/TypeScript), Java Swing (desktop UI), Cross-browser testing, Parallel testing</w:t>
       </w:r>
     </w:p>
     <w:p>
@@ -149,7 +149,7 @@
         <w:t xml:space="preserve">Unit &amp; Integration Testing: </w:t>
       </w:r>
       <w:r>
-        <w:t>nUnit, xUnit, jUnit, PHPUnit, WTT (Microsoft internal), SAW (Docusign internal)</w:t>
+        <w:t>nUnit, xUnit, jUnit, PHPUnit, WTT (Microsoft internal), SAW (Docusign internal), TestNG</w:t>
       </w:r>
     </w:p>
     <w:p>
@@ -163,7 +163,7 @@
         <w:t xml:space="preserve">Test Management &amp; Planning: </w:t>
       </w:r>
       <w:r>
-        <w:t>MTM, TFS, test plan design, bug triage, exploratory testing (black/white box)</w:t>
+        <w:t>MTM, TFS, test plan design, bug triage, exploratory testing (black/white box), Team Track (defect tracking), Playwright reports, Cucumber reports, test reporting</w:t>
       </w:r>
     </w:p>
     <w:p>
@@ -191,7 +191,7 @@
         <w:t xml:space="preserve">CI/CD &amp; DevOps: </w:t>
       </w:r>
       <w:r>
-        <w:t>Jenkins, Hudson, Octopus, Azure Pipelines, GitHub Actions / GitHub Workflows, Docker, Kubernetes, Ansible</w:t>
+        <w:t>Jenkins, Hudson, Octopus, Azure Pipelines, GitHub Actions / GitHub Workflows, Docker, Kubernetes, Ansible, CI/CD, CI/CD pipelines, Continuous Integration/Continuous Delivery (CI/CD), Terraform, Azure, Ant</w:t>
       </w:r>
     </w:p>
     <w:p>
@@ -205,7 +205,7 @@
         <w:t xml:space="preserve">Databases &amp; Query Languages: </w:t>
       </w:r>
       <w:r>
-        <w:t>SQL, Kusto, MongoDB, Kusto Query Language, KQL</w:t>
+        <w:t>SQL, Kusto, MongoDB, Kusto Query Language, KQL, Oracle SQL</w:t>
       </w:r>
     </w:p>
     <w:p>
@@ -219,7 +219,7 @@
         <w:t xml:space="preserve">Version Control: </w:t>
       </w:r>
       <w:r>
-        <w:t>Git, Mercurial, TFS, Source Depot, PVCS</w:t>
+        <w:t>Git, Mercurial, TFS, Source Depot, PVCS, GitHub</w:t>
       </w:r>
     </w:p>
     <w:p>
@@ -247,7 +247,7 @@
         <w:t xml:space="preserve">Virtualization &amp; Infra: </w:t>
       </w:r>
       <w:r>
-        <w:t>Docker, Kubernetes, HyperV, VirtualBox, Proxmox, WSL</w:t>
+        <w:t>Docker, Kubernetes, HyperV, VirtualBox, Proxmox, WSL, Azure, Terraform</w:t>
       </w:r>
     </w:p>
     <w:p>
@@ -261,7 +261,7 @@
         <w:t xml:space="preserve">Developer Tools &amp; IDEs: </w:t>
       </w:r>
       <w:r>
-        <w:t>VS Code (Git/GitHub integration)</w:t>
+        <w:t>VS Code (Git/GitHub integration), Eclipse, Borland JBuilder, Excel (reporting automation)</w:t>
       </w:r>
     </w:p>
     <w:p>
@@ -275,7 +275,7 @@
         <w:t xml:space="preserve">AI &amp; Automation Tooling: </w:t>
       </w:r>
       <w:r>
-        <w:t>LLM-assisted content/document generation (Claude), structured JSON knowledge-base design for LLM consumption, prompt/instruction engineering for repeatable AI workflows, AI-assisted CI/CD pipeline design (GitHub Actions + LLM API)</w:t>
+        <w:t>LLM-assisted content/document generation (Claude), structured JSON knowledge-base design for LLM consumption, prompt/instruction engineering for repeatable AI workflows, AI-assisted CI/CD pipeline design (GitHub Actions + LLM API), LLM, Ollama (local LLM hosting), GitHub Copilot, Claude Code, Claude.ai, Perplexity, Antigravity, Tabnine, prompt engineering</w:t>
       </w:r>
     </w:p>
     <w:p>
@@ -289,7 +289,7 @@
         <w:t xml:space="preserve">Methodologies: </w:t>
       </w:r>
       <w:r>
-        <w:t>Agile, Scrum, Kanban, TDD, Waterfall, DevOps</w:t>
+        <w:t>Agile, Scrum, Kanban, TDD, Waterfall, DevOps, Freelancing, BDD (Behavior-Driven Development)</w:t>
       </w:r>
     </w:p>
     <w:p>
@@ -336,6 +336,48 @@
     </w:p>
     <w:p>
       <w:pPr>
+        <w:spacing w:after="40" w:before="0"/>
+      </w:pPr>
+      <w:r>
+        <w:rPr>
+          <w:b/>
+        </w:rPr>
+        <w:t xml:space="preserve">Cloud And Infrastructure As Code: </w:t>
+      </w:r>
+      <w:r>
+        <w:t>Azure, Terraform, Docker, Kubernetes, Ansible</w:t>
+      </w:r>
+    </w:p>
+    <w:p>
+      <w:pPr>
+        <w:spacing w:after="40" w:before="0"/>
+      </w:pPr>
+      <w:r>
+        <w:rPr>
+          <w:b/>
+        </w:rPr>
+        <w:t xml:space="preserve">Scripting And Automation: </w:t>
+      </w:r>
+      <w:r>
+        <w:t>PowerShell, Bash, Shell scripting, Python, JavaScript, TypeScript</w:t>
+      </w:r>
+    </w:p>
+    <w:p>
+      <w:pPr>
+        <w:spacing w:after="40" w:before="0"/>
+      </w:pPr>
+      <w:r>
+        <w:rPr>
+          <w:b/>
+        </w:rPr>
+        <w:t xml:space="preserve">Freelance And Independent Work: </w:t>
+      </w:r>
+      <w:r>
+        <w:t>Freelancing</w:t>
+      </w:r>
+    </w:p>
+    <w:p>
+      <w:pPr>
         <w:spacing w:after="20" w:before="200"/>
         <w:pBdr>
           <w:bottom w:val="single" w:sz="6" w:color="1F3864"/>
@@ -345,7 +387,7 @@
         <w:rPr>
           <w:b/>
           <w:color w:val="1F3864"/>
-          <w:sz w:val="22"/>
+          <w:sz w:val="21"/>
         </w:rPr>
         <w:t>WORK EXPERIENCE</w:t>
       </w:r>
@@ -357,9 +399,139 @@
         <w:tblLook w:firstColumn="1" w:firstRow="1" w:lastColumn="0" w:lastRow="0" w:noHBand="0" w:noVBand="1" w:val="04A0"/>
       </w:tblPr>
       <w:tblGrid>
-        <w:gridCol w:w="3774"/>
-        <w:gridCol w:w="4203"/>
-        <w:gridCol w:w="2103"/>
+        <w:gridCol w:w="4089"/>
+        <w:gridCol w:w="3991"/>
+        <w:gridCol w:w="2001"/>
+      </w:tblGrid>
+      <w:tr>
+        <w:tc>
+          <w:tcPr>
+            <w:tcW w:type="dxa" w:w="3360"/>
+          </w:tcPr>
+          <w:p>
+            <w:pPr>
+              <w:spacing w:after="0" w:before="0"/>
+            </w:pPr>
+            <w:r>
+              <w:rPr>
+                <w:b/>
+              </w:rPr>
+              <w:t>Software Development Engineer</w:t>
+            </w:r>
+          </w:p>
+        </w:tc>
+        <w:tc>
+          <w:tcPr>
+            <w:tcW w:type="dxa" w:w="3360"/>
+          </w:tcPr>
+          <w:p>
+            <w:pPr>
+              <w:spacing w:after="0" w:before="0"/>
+            </w:pPr>
+            <w:r>
+              <w:rPr>
+                <w:b/>
+              </w:rPr>
+              <w:t>Freelance (Self-Employed)</w:t>
+            </w:r>
+          </w:p>
+        </w:tc>
+        <w:tc>
+          <w:tcPr>
+            <w:tcW w:type="dxa" w:w="3360"/>
+          </w:tcPr>
+          <w:p>
+            <w:pPr>
+              <w:spacing w:after="0" w:before="0"/>
+              <w:jc w:val="right"/>
+            </w:pPr>
+            <w:r>
+              <w:rPr>
+                <w:b/>
+              </w:rPr>
+              <w:t>Aug 2025 to Present</w:t>
+            </w:r>
+          </w:p>
+        </w:tc>
+      </w:tr>
+    </w:tbl>
+    <w:p>
+      <w:pPr>
+        <w:spacing w:after="60" w:before="0"/>
+      </w:pPr>
+      <w:r>
+        <w:rPr>
+          <w:i/>
+          <w:color w:val="1F3864"/>
+          <w:sz w:val="17"/>
+        </w:rPr>
+        <w:t>Freelancing · Playwright · JavaScript · TypeScript · Python · PowerShell · Bash · Shell scripting · CI/CD · GitHub Actions · LLM · Ollama · GitHub Copilot · Claude Code · Claude.ai · Perplexity</w:t>
+      </w:r>
+    </w:p>
+    <w:p>
+      <w:pPr>
+        <w:pStyle w:val="ListBullet"/>
+        <w:spacing w:after="20" w:before="0"/>
+      </w:pPr>
+      <w:r>
+        <w:t>Delivered freelance software engineering and automation work using Python, JavaScript, TypeScript, PowerShell, Bash, and shell scripting.</w:t>
+      </w:r>
+    </w:p>
+    <w:p>
+      <w:pPr>
+        <w:pStyle w:val="ListBullet"/>
+        <w:spacing w:after="20" w:before="0"/>
+      </w:pPr>
+      <w:r>
+        <w:t>Built automated browser and end-to-end tests with Playwright in JavaScript and TypeScript.</w:t>
+      </w:r>
+    </w:p>
+    <w:p>
+      <w:pPr>
+        <w:pStyle w:val="ListBullet"/>
+        <w:spacing w:after="20" w:before="0"/>
+      </w:pPr>
+      <w:r>
+        <w:t>Designed CI/CD pipelines using GitHub Actions to automate build, test, and release workflows, including AI-assisted pipelines that call an LLM API.</w:t>
+      </w:r>
+    </w:p>
+    <w:p>
+      <w:pPr>
+        <w:pStyle w:val="ListBullet"/>
+        <w:spacing w:after="20" w:before="0"/>
+      </w:pPr>
+      <w:r>
+        <w:t>Designed a structured JSON knowledge base and repeatable prompt instructions that let a local LLM running on Ollama generate tailored resumes and cover letters.</w:t>
+      </w:r>
+    </w:p>
+    <w:p>
+      <w:pPr>
+        <w:pStyle w:val="ListBullet"/>
+        <w:spacing w:after="20" w:before="0"/>
+      </w:pPr>
+      <w:r>
+        <w:t>Applied AI-assisted development tools, including GitHub Copilot, Claude Code, Claude.ai, and Perplexity, to accelerate coding, debugging, research, and documentation.</w:t>
+      </w:r>
+    </w:p>
+    <w:p>
+      <w:pPr>
+        <w:pStyle w:val="ListBullet"/>
+        <w:spacing w:after="120" w:before="0"/>
+      </w:pPr>
+      <w:r>
+        <w:t>Wrote PowerShell, Bash, and shell scripts to automate repetitive setup, testing, and deployment tasks across Windows and Linux environments.</w:t>
+      </w:r>
+    </w:p>
+    <w:tbl>
+      <w:tblPr>
+        <w:tblW w:type="auto" w:w="0"/>
+        <w:tblLayout w:type="autofit"/>
+        <w:tblLook w:firstColumn="1" w:firstRow="1" w:lastColumn="0" w:lastRow="0" w:noHBand="0" w:noVBand="1" w:val="04A0"/>
+      </w:tblPr>
+      <w:tblGrid>
+        <w:gridCol w:w="4089"/>
+        <w:gridCol w:w="3991"/>
+        <w:gridCol w:w="2001"/>
       </w:tblGrid>
       <w:tr>
         <w:tc>
@@ -421,7 +593,7 @@
         <w:rPr>
           <w:i/>
           <w:color w:val="1F3864"/>
-          <w:sz w:val="18"/>
+          <w:sz w:val="17"/>
         </w:rPr>
         <w:t>Docusign Connect · Connect Test Listener (webhook) · Ruby Webhook Test Interface · x509 Certificate Management</w:t>
       </w:r>
@@ -478,9 +650,9 @@
         <w:tblLook w:firstColumn="1" w:firstRow="1" w:lastColumn="0" w:lastRow="0" w:noHBand="0" w:noVBand="1" w:val="04A0"/>
       </w:tblPr>
       <w:tblGrid>
-        <w:gridCol w:w="3774"/>
-        <w:gridCol w:w="4203"/>
-        <w:gridCol w:w="2103"/>
+        <w:gridCol w:w="4089"/>
+        <w:gridCol w:w="3991"/>
+        <w:gridCol w:w="2001"/>
       </w:tblGrid>
       <w:tr>
         <w:tc>
@@ -542,7 +714,7 @@
         <w:rPr>
           <w:i/>
           <w:color w:val="1F3864"/>
-          <w:sz w:val="18"/>
+          <w:sz w:val="17"/>
         </w:rPr>
         <w:t>Docusign Connect · Product Incubation Team · Docusign Print Tool (deprecated)</w:t>
       </w:r>
@@ -662,9 +834,9 @@
         <w:tblLook w:firstColumn="1" w:firstRow="1" w:lastColumn="0" w:lastRow="0" w:noHBand="0" w:noVBand="1" w:val="04A0"/>
       </w:tblPr>
       <w:tblGrid>
-        <w:gridCol w:w="3774"/>
-        <w:gridCol w:w="4203"/>
-        <w:gridCol w:w="2103"/>
+        <w:gridCol w:w="4089"/>
+        <w:gridCol w:w="3991"/>
+        <w:gridCol w:w="2001"/>
       </w:tblGrid>
       <w:tr>
         <w:tc>
@@ -726,7 +898,7 @@
         <w:rPr>
           <w:i/>
           <w:color w:val="1F3864"/>
-          <w:sz w:val="18"/>
+          <w:sz w:val="17"/>
         </w:rPr>
         <w:t>Team Foundation Server · Microsoft Test Manager · C#</w:t>
       </w:r>
@@ -756,9 +928,9 @@
         <w:tblLook w:firstColumn="1" w:firstRow="1" w:lastColumn="0" w:lastRow="0" w:noHBand="0" w:noVBand="1" w:val="04A0"/>
       </w:tblPr>
       <w:tblGrid>
-        <w:gridCol w:w="3774"/>
-        <w:gridCol w:w="4203"/>
-        <w:gridCol w:w="2103"/>
+        <w:gridCol w:w="4089"/>
+        <w:gridCol w:w="3991"/>
+        <w:gridCol w:w="2001"/>
       </w:tblGrid>
       <w:tr>
         <w:tc>
@@ -820,7 +992,7 @@
         <w:rPr>
           <w:i/>
           <w:color w:val="1F3864"/>
-          <w:sz w:val="18"/>
+          <w:sz w:val="17"/>
         </w:rPr>
         <w:t>Linux · Eclipse · Hudson · Ant · TestNG · Java · Selenium</w:t>
       </w:r>
@@ -841,9 +1013,9 @@
         <w:tblLook w:firstColumn="1" w:firstRow="1" w:lastColumn="0" w:lastRow="0" w:noHBand="0" w:noVBand="1" w:val="04A0"/>
       </w:tblPr>
       <w:tblGrid>
-        <w:gridCol w:w="3774"/>
-        <w:gridCol w:w="4203"/>
-        <w:gridCol w:w="2103"/>
+        <w:gridCol w:w="4089"/>
+        <w:gridCol w:w="3991"/>
+        <w:gridCol w:w="2001"/>
       </w:tblGrid>
       <w:tr>
         <w:tc>
@@ -905,7 +1077,7 @@
         <w:rPr>
           <w:i/>
           <w:color w:val="1F3864"/>
-          <w:sz w:val="18"/>
+          <w:sz w:val="17"/>
         </w:rPr>
         <w:t>C# · SQL · WTT · Kahuna Automation Framework (KAF) · NUnit · Source Depot · HyperV · Octopus</w:t>
       </w:r>
@@ -944,9 +1116,9 @@
         <w:tblLook w:firstColumn="1" w:firstRow="1" w:lastColumn="0" w:lastRow="0" w:noHBand="0" w:noVBand="1" w:val="04A0"/>
       </w:tblPr>
       <w:tblGrid>
-        <w:gridCol w:w="3774"/>
-        <w:gridCol w:w="4203"/>
-        <w:gridCol w:w="2103"/>
+        <w:gridCol w:w="4089"/>
+        <w:gridCol w:w="3991"/>
+        <w:gridCol w:w="2001"/>
       </w:tblGrid>
       <w:tr>
         <w:tc>
@@ -1008,7 +1180,7 @@
         <w:rPr>
           <w:i/>
           <w:color w:val="1F3864"/>
-          <w:sz w:val="18"/>
+          <w:sz w:val="17"/>
         </w:rPr>
         <w:t>C# · SQL · WTT · Echo · KAF · NUnit · iMacros · REST · XML · HyperV</w:t>
       </w:r>
@@ -1065,9 +1237,9 @@
         <w:tblLook w:firstColumn="1" w:firstRow="1" w:lastColumn="0" w:lastRow="0" w:noHBand="0" w:noVBand="1" w:val="04A0"/>
       </w:tblPr>
       <w:tblGrid>
-        <w:gridCol w:w="3774"/>
-        <w:gridCol w:w="4203"/>
-        <w:gridCol w:w="2103"/>
+        <w:gridCol w:w="4089"/>
+        <w:gridCol w:w="3991"/>
+        <w:gridCol w:w="2001"/>
       </w:tblGrid>
       <w:tr>
         <w:tc>
@@ -1129,7 +1301,7 @@
         <w:rPr>
           <w:i/>
           <w:color w:val="1F3864"/>
-          <w:sz w:val="18"/>
+          <w:sz w:val="17"/>
         </w:rPr>
         <w:t>Borland JBuilder · Java · Swing · Borland C++ · Oracle SQL · PVCS/Serena</w:t>
       </w:r>
@@ -1159,9 +1331,9 @@
         <w:tblLook w:firstColumn="1" w:firstRow="1" w:lastColumn="0" w:lastRow="0" w:noHBand="0" w:noVBand="1" w:val="04A0"/>
       </w:tblPr>
       <w:tblGrid>
-        <w:gridCol w:w="3774"/>
-        <w:gridCol w:w="4203"/>
-        <w:gridCol w:w="2103"/>
+        <w:gridCol w:w="4089"/>
+        <w:gridCol w:w="3991"/>
+        <w:gridCol w:w="2001"/>
       </w:tblGrid>
       <w:tr>
         <w:tc>
@@ -1223,7 +1395,7 @@
         <w:rPr>
           <w:i/>
           <w:color w:val="1F3864"/>
-          <w:sz w:val="18"/>
+          <w:sz w:val="17"/>
         </w:rPr>
         <w:t>Excel · iMacros · Visual Basic · Team Track</w:t>
       </w:r>
@@ -1257,7 +1429,7 @@
         <w:rPr>
           <w:b/>
           <w:color w:val="1F3864"/>
-          <w:sz w:val="22"/>
+          <w:sz w:val="21"/>
         </w:rPr>
         <w:t>EDUCATION</w:t>
       </w:r>
@@ -1644,7 +1816,7 @@
     <w:qFormat/>
     <w:rsid w:val="00FC693F"/>
     <w:rPr>
-      <w:sz w:val="19"/>
+      <w:sz w:val="18"/>
     </w:rPr>
   </w:style>
   <w:style w:type="paragraph" w:styleId="Header">

</xml_diff>

<commit_message>
Regenerate resumes/cover letters (2026-10-30_052826)
</commit_message>
<xml_diff>
--- a/generated/SDE/Dennis Dole Resume (SDE).docx
+++ b/generated/SDE/Dennis Dole Resume (SDE).docx
@@ -1442,6 +1442,14 @@
         <w:t>Bachelor of Science in Computer Science, Michigan Technological University (2004)</w:t>
       </w:r>
     </w:p>
+    <w:p>
+      <w:pPr>
+        <w:spacing w:after="20" w:before="0"/>
+      </w:pPr>
+      <w:r>
+        <w:t>JavaScript and Playwright Automation with AI Program (Certificate of Completion), CYDEO (Sep 2026)</w:t>
+      </w:r>
+    </w:p>
     <w:sectPr>
       <w:pgSz w:w="12240" w:h="15840"/>
       <w:pgMar w:top="800" w:right="1080" w:bottom="800" w:left="1080" w:header="720" w:footer="720" w:gutter="0"/>

</xml_diff>